<commit_message>
Add professional profile photo
</commit_message>
<xml_diff>
--- a/Murray Lewin Resume - Fortescue (ATS).docx
+++ b/Murray Lewin Resume - Fortescue (ATS).docx
@@ -1,8 +1,106 @@
 
-<file path=word/document.xml><?xml version="1.0" encoding="utf-8"?>
+<file path=customXml\item1.xml><?xml version="1.0" encoding="utf-8"?>
+<b:Sources xmlns:b="http://schemas.openxmlformats.org/officeDocument/2006/bibliography" xmlns="http://schemas.openxmlformats.org/officeDocument/2006/bibliography" SelectedStyle="/APA.XSL" StyleName="APA"/>
+</file>
+
+<file path=customXml\itemProps1.xml><?xml version="1.0" encoding="utf-8"?>
+<ds:datastoreItem xmlns:ds="http://schemas.openxmlformats.org/officeDocument/2006/customXml" ds:itemID="{EF278816-EC6F-A645-907D-7F25AECB1D4A}">
+  <ds:schemaRefs>
+    <ds:schemaRef ds:uri="http://schemas.openxmlformats.org/officeDocument/2006/bibliography"/>
+  </ds:schemaRefs>
+</ds:datastoreItem>
+</file>
+
+<file path=docProps\app.xml><?xml version="1.0" encoding="utf-8"?>
+<Properties xmlns="http://schemas.openxmlformats.org/officeDocument/2006/extended-properties" xmlns:vt="http://schemas.openxmlformats.org/officeDocument/2006/docPropsVTypes">
+  <Template>Normal.dotm</Template>
+  <TotalTime>0</TotalTime>
+  <Pages>1</Pages>
+  <Words>0</Words>
+  <Characters>0</Characters>
+  <Application>Microsoft Macintosh Word</Application>
+  <DocSecurity>0</DocSecurity>
+  <Lines>0</Lines>
+  <Paragraphs>0</Paragraphs>
+  <ScaleCrop>false</ScaleCrop>
+  <HeadingPairs>
+    <vt:vector size="2" baseType="variant">
+      <vt:variant>
+        <vt:lpstr>Title</vt:lpstr>
+      </vt:variant>
+      <vt:variant>
+        <vt:i4>1</vt:i4>
+      </vt:variant>
+    </vt:vector>
+  </HeadingPairs>
+  <TitlesOfParts>
+    <vt:vector size="1" baseType="lpstr">
+      <vt:lpstr/>
+    </vt:vector>
+  </TitlesOfParts>
+  <Manager/>
+  <Company/>
+  <LinksUpToDate>false</LinksUpToDate>
+  <CharactersWithSpaces>0</CharactersWithSpaces>
+  <SharedDoc>false</SharedDoc>
+  <HyperlinkBase/>
+  <HyperlinksChanged>false</HyperlinksChanged>
+  <AppVersion>14.0000</AppVersion>
+</Properties>
+</file>
+
+<file path=docProps\core.xml><?xml version="1.0" encoding="utf-8"?>
+<cp:coreProperties xmlns:cp="http://schemas.openxmlformats.org/package/2006/metadata/core-properties" xmlns:dc="http://purl.org/dc/elements/1.1/" xmlns:dcterms="http://purl.org/dc/terms/" xmlns:dcmitype="http://purl.org/dc/dcmitype/" xmlns:xsi="http://www.w3.org/2001/XMLSchema-instance">
+  <dc:title/>
+  <dc:subject/>
+  <dc:creator>python-docx</dc:creator>
+  <cp:keywords/>
+  <dc:description>generated by python-docx</dc:description>
+  <cp:lastModifiedBy/>
+  <cp:revision>1</cp:revision>
+  <dcterms:created xsi:type="dcterms:W3CDTF">2013-12-23T23:15:00Z</dcterms:created>
+  <dcterms:modified xsi:type="dcterms:W3CDTF">2013-12-23T23:15:00Z</dcterms:modified>
+  <cp:category/>
+</cp:coreProperties>
+</file>
+
+<file path=word\document.xml><?xml version="1.0" encoding="utf-8"?>
 <w:document xmlns:wpc="http://schemas.microsoft.com/office/word/2010/wordprocessingCanvas" xmlns:mo="http://schemas.microsoft.com/office/mac/office/2008/main" xmlns:mc="http://schemas.openxmlformats.org/markup-compatibility/2006" xmlns:mv="urn:schemas-microsoft-com:mac:vml" xmlns:o="urn:schemas-microsoft-com:office:office" xmlns:r="http://schemas.openxmlformats.org/officeDocument/2006/relationships" xmlns:m="http://schemas.openxmlformats.org/officeDocument/2006/math" xmlns:v="urn:schemas-microsoft-com:vml" xmlns:wp14="http://schemas.microsoft.com/office/word/2010/wordprocessingDrawing" xmlns:wp="http://schemas.openxmlformats.org/drawingml/2006/wordprocessingDrawing" xmlns:w10="urn:schemas-microsoft-com:office:word" xmlns:w="http://schemas.openxmlformats.org/wordprocessingml/2006/main" xmlns:w14="http://schemas.microsoft.com/office/word/2010/wordml" xmlns:wpg="http://schemas.microsoft.com/office/word/2010/wordprocessingGroup" xmlns:wpi="http://schemas.microsoft.com/office/word/2010/wordprocessingInk" xmlns:wne="http://schemas.microsoft.com/office/word/2006/wordml" xmlns:wps="http://schemas.microsoft.com/office/word/2010/wordprocessingShape" mc:Ignorable="w14 wp14">
   <w:body>
     <w:p>
+      <w:r xmlns:w="http://schemas.openxmlformats.org/wordprocessingml/2006/main" xmlns:wp="http://schemas.openxmlformats.org/drawingml/2006/wordprocessingDrawing" xmlns:a="http://schemas.openxmlformats.org/drawingml/2006/main" xmlns:pic="http://schemas.openxmlformats.org/drawingml/2006/picture" xmlns:r="http://schemas.openxmlformats.org/officeDocument/2006/relationships">
+        <w:drawing>
+          <wp:inline distT="0" distB="0" distL="0" distR="0">
+            <wp:extent cx="914400" cy="914400"/>
+            <wp:docPr id="9001" name="Profile photo" descr="Portrait of Murray Lewin"/>
+            <a:graphic>
+              <a:graphicData uri="http://schemas.openxmlformats.org/drawingml/2006/picture">
+                <pic:pic>
+                  <pic:nvPicPr>
+                    <pic:cNvPr id="0" name="profile-photo.jpg"/>
+                    <pic:cNvPicPr/>
+                  </pic:nvPicPr>
+                  <pic:blipFill>
+                    <a:blip r:embed="rIdProfilePhoto"/>
+                    <a:stretch>
+                      <a:fillRect/>
+                    </a:stretch>
+                  </pic:blipFill>
+                  <pic:spPr>
+                    <a:xfrm>
+                      <a:off x="0" y="0"/>
+                      <a:ext cx="914400" cy="914400"/>
+                    </a:xfrm>
+                    <a:prstGeom prst="rect">
+                      <a:avLst/>
+                    </a:prstGeom>
+                  </pic:spPr>
+                </pic:pic>
+              </a:graphicData>
+            </a:graphic>
+          </wp:inline>
+        </w:drawing>
+      </w:r>
       <w:pPr>
         <w:spacing w:before="0" w:after="0"/>
         <w:jc w:val="center"/>
@@ -63,7 +161,7 @@
           <w:b w:val="0"/>
           <w:sz w:val="20"/>
         </w:rPr>
-        <w:t>I am a consultant engineer in Deloitte’s Strategy, Risk and Transactions practice, within the specialist asset management team. My work centres on maintenance strategy optimisation, reliability analysis and the maintenance master data that underpins both.</w:t>
+        <w:t>I am a consultant engineer in Deloitteâ€™s Strategy, Risk and Transactions practice, within the specialist asset management team. My work centres on maintenance strategy optimisation, reliability analysis and the maintenance master data that underpins both.</w:t>
       </w:r>
     </w:p>
     <w:p>
@@ -88,7 +186,7 @@
           <w:b w:val="0"/>
           <w:sz w:val="20"/>
         </w:rPr>
-        <w:t>I heard about this role through my brother, who works at Fortescue, and it stood out immediately. Most of my work sits in maintenance strategy optimisation and the master data underneath it – FLOC hierarchies, BOM validation, material classification and work order coding – because a strategy is only ever as good as the data it runs on. The past two years have been spent turning messy SAP and operational data into reliability insight, defect elimination and better work management. Fortescue’s approach of leading through doing, and the chance to build proof-of-concept tools alongside software and data engineers rather than hand requirements over, is exactly the environment I am looking for.</w:t>
+        <w:t>I heard about this role through my brother, who works at Fortescue, and it stood out immediately. Most of my work sits in maintenance strategy optimisation and the master data underneath it â€“ FLOC hierarchies, BOM validation, material classification and work order coding â€“ because a strategy is only ever as good as the data it runs on. The past two years have been spent turning messy SAP and operational data into reliability insight, defect elimination and better work management. Fortescueâ€™s approach of leading through doing, and the chance to build proof-of-concept tools alongside software and data engineers rather than hand requirements over, is exactly the environment I am looking for.</w:t>
       </w:r>
     </w:p>
     <w:p>
@@ -174,7 +272,7 @@
           <w:b/>
           <w:sz w:val="20"/>
         </w:rPr>
-        <w:t>Deloitte Touche Tohmatsu Limited Australia – Global Iron Ore Producer (Pilbara)</w:t>
+        <w:t>Deloitte Touche Tohmatsu Limited Australia â€“ Global Iron Ore Producer (Pilbara)</w:t>
       </w:r>
     </w:p>
     <w:p>
@@ -186,7 +284,7 @@
           <w:i/>
           <w:sz w:val="19"/>
         </w:rPr>
-        <w:t>Maintenance System Optimisation (MSO), Consultant Engineer  |  January 2026 – Present</w:t>
+        <w:t>Maintenance System Optimisation (MSO), Consultant Engineer  |  January 2026 â€“ Present</w:t>
       </w:r>
     </w:p>
     <w:p>
@@ -198,7 +296,7 @@
           <w:b w:val="0"/>
           <w:sz w:val="20"/>
         </w:rPr>
-        <w:t>As part of a multi-disciplinary delivery team, I helped build a full-stack, cloud-native AI application that modernises and automates maintenance strategy processes across Heavy Mobile Equipment (HME) and Fixed Plant (FXP) assets. It replaces fragmented, manual engineering workflows with AI-augmented data review, statistical reliability modelling and data-driven maintenance optimisation, integrating Databricks and SAP work order data for end-to-end traceability from raw operational data through to validated maintenance recommendations. My contribution spanned reliability modelling, application features and data visualisation, alongside the team’s LLM specialists. The product is rolling out to production, with projected annual savings of $35 million.</w:t>
+        <w:t>As part of a multi-disciplinary delivery team, I helped build a full-stack, cloud-native AI application that modernises and automates maintenance strategy processes across Heavy Mobile Equipment (HME) and Fixed Plant (FXP) assets. It replaces fragmented, manual engineering workflows with AI-augmented data review, statistical reliability modelling and data-driven maintenance optimisation, integrating Databricks and SAP work order data for end-to-end traceability from raw operational data through to validated maintenance recommendations. My contribution spanned reliability modelling, application features and data visualisation, alongside the teamâ€™s LLM specialists. The product is rolling out to production, with projected annual savings of $35 million.</w:t>
       </w:r>
     </w:p>
     <w:p>
@@ -210,7 +308,7 @@
         <w:rPr>
           <w:sz w:val="20"/>
         </w:rPr>
-        <w:t>Maintenance master data – human-in-the-loop review workflows for AI-generated material classifications, FLOC BOM validation and work order classification.</w:t>
+        <w:t>Maintenance master data â€“ human-in-the-loop review workflows for AI-generated material classifications, FLOC BOM validation and work order classification.</w:t>
       </w:r>
     </w:p>
     <w:p>
@@ -222,7 +320,7 @@
         <w:rPr>
           <w:sz w:val="20"/>
         </w:rPr>
-        <w:t>Reliability engineering – Weibull analysis, MTBF/MTTF calculation, Asset Health Index scoring, component age analysis and replacement projection modelling.</w:t>
+        <w:t>Reliability engineering â€“ Weibull analysis, MTBF/MTTF calculation, Asset Health Index scoring, component age analysis and replacement projection modelling.</w:t>
       </w:r>
     </w:p>
     <w:p>
@@ -234,7 +332,7 @@
         <w:rPr>
           <w:sz w:val="20"/>
         </w:rPr>
-        <w:t>Maintenance strategy optimisation – turning reliability outputs into data-driven maintenance tactic and component replacement recommendations for engineer sign-off.</w:t>
+        <w:t>Maintenance strategy optimisation â€“ turning reliability outputs into data-driven maintenance tactic and component replacement recommendations for engineer sign-off.</w:t>
       </w:r>
     </w:p>
     <w:p>
@@ -246,7 +344,7 @@
         <w:rPr>
           <w:sz w:val="20"/>
         </w:rPr>
-        <w:t>Full-stack development – React/TypeScript front-end features and Python/FastAPI REST endpoints, built to the team’s vertical-slice architecture.</w:t>
+        <w:t>Full-stack development â€“ React/TypeScript front-end features and Python/FastAPI REST endpoints, built to the teamâ€™s vertical-slice architecture.</w:t>
       </w:r>
     </w:p>
     <w:p>
@@ -258,7 +356,7 @@
         <w:rPr>
           <w:sz w:val="20"/>
         </w:rPr>
-        <w:t>Data engineering &amp; cloud – Databricks Gold-layer products and SAP work order data into a PostgreSQL application database, deployed on Azure Container Apps.</w:t>
+        <w:t>Data engineering &amp; cloud â€“ Databricks Gold-layer products and SAP work order data into a PostgreSQL application database, deployed on Azure Container Apps.</w:t>
       </w:r>
     </w:p>
     <w:p>
@@ -270,7 +368,7 @@
         <w:rPr>
           <w:sz w:val="20"/>
         </w:rPr>
-        <w:t>Data visualisation – interactive reliability charts including Weibull curves, age analysis timelines and health index dashboards using Plotly.js.</w:t>
+        <w:t>Data visualisation â€“ interactive reliability charts including Weibull curves, age analysis timelines and health index dashboards using Plotly.js.</w:t>
       </w:r>
     </w:p>
     <w:p>
@@ -282,7 +380,7 @@
           <w:b/>
           <w:sz w:val="20"/>
         </w:rPr>
-        <w:t>Deloitte Touche Tohmatsu Limited Australia – Global Gold Mining Operator</w:t>
+        <w:t>Deloitte Touche Tohmatsu Limited Australia â€“ Global Gold Mining Operator</w:t>
       </w:r>
     </w:p>
     <w:p>
@@ -294,7 +392,7 @@
           <w:i/>
           <w:sz w:val="19"/>
         </w:rPr>
-        <w:t>Group Asset Management Framework (Phase 1 and 2), Consultant Engineer  |  September 2025 – January 2026</w:t>
+        <w:t>Group Asset Management Framework (Phase 1 and 2), Consultant Engineer  |  September 2025 â€“ January 2026</w:t>
       </w:r>
     </w:p>
     <w:p>
@@ -342,7 +440,7 @@
           <w:b/>
           <w:sz w:val="20"/>
         </w:rPr>
-        <w:t>Deloitte Touche Tohmatsu Limited Australia – Global Iron Ore Producer (Pilbara)</w:t>
+        <w:t>Deloitte Touche Tohmatsu Limited Australia â€“ Global Iron Ore Producer (Pilbara)</w:t>
       </w:r>
     </w:p>
     <w:p>
@@ -354,7 +452,7 @@
           <w:i/>
           <w:sz w:val="19"/>
         </w:rPr>
-        <w:t>Asset Health Index Rollout (Fixed Plant), Consultant Engineer  |  March 2025 – September 2025</w:t>
+        <w:t>Asset Health Index Rollout (Fixed Plant), Consultant Engineer  |  March 2025 â€“ September 2025</w:t>
       </w:r>
     </w:p>
     <w:p>
@@ -402,7 +500,7 @@
           <w:b/>
           <w:sz w:val="20"/>
         </w:rPr>
-        <w:t>Deloitte Touche Tohmatsu Limited Australia – Iron Ore Producer (Pilbara)</w:t>
+        <w:t>Deloitte Touche Tohmatsu Limited Australia â€“ Iron Ore Producer (Pilbara)</w:t>
       </w:r>
     </w:p>
     <w:p>
@@ -414,7 +512,7 @@
           <w:i/>
           <w:sz w:val="19"/>
         </w:rPr>
-        <w:t>Labour Benchmarking Review, Data &amp; Reporting Analyst  |  January 2025 – March 2025</w:t>
+        <w:t>Labour Benchmarking Review, Data &amp; Reporting Analyst  |  January 2025 â€“ March 2025</w:t>
       </w:r>
     </w:p>
     <w:p>
@@ -462,7 +560,7 @@
           <w:b/>
           <w:sz w:val="20"/>
         </w:rPr>
-        <w:t>Deloitte Touche Tohmatsu Limited Australia – Global Iron Ore Producer (Pilbara)</w:t>
+        <w:t>Deloitte Touche Tohmatsu Limited Australia â€“ Global Iron Ore Producer (Pilbara)</w:t>
       </w:r>
     </w:p>
     <w:p>
@@ -474,7 +572,7 @@
           <w:i/>
           <w:sz w:val="19"/>
         </w:rPr>
-        <w:t>Asset Management Plans (Substations), Engineering Analyst  |  September 2024 – December 2024</w:t>
+        <w:t>Asset Management Plans (Substations), Engineering Analyst  |  September 2024 â€“ December 2024</w:t>
       </w:r>
     </w:p>
     <w:p>
@@ -498,7 +596,7 @@
         <w:rPr>
           <w:sz w:val="20"/>
         </w:rPr>
-        <w:t>Substation site validation – checking that the correct regulatory precautions are taken in low voltage substations.</w:t>
+        <w:t>Substation site validation â€“ checking that the correct regulatory precautions are taken in low voltage substations.</w:t>
       </w:r>
     </w:p>
     <w:p>
@@ -522,7 +620,7 @@
           <w:b/>
           <w:sz w:val="20"/>
         </w:rPr>
-        <w:t>Deloitte Touche Tohmatsu Limited Australia – Global Iron Ore Producer (Pilbara)</w:t>
+        <w:t>Deloitte Touche Tohmatsu Limited Australia â€“ Global Iron Ore Producer (Pilbara)</w:t>
       </w:r>
     </w:p>
     <w:p>
@@ -534,7 +632,7 @@
           <w:i/>
           <w:sz w:val="19"/>
         </w:rPr>
-        <w:t>Asset Management Uplift Programme (Asset Tactics Review), Graduate Team Member  |  June 2024 – September 2024</w:t>
+        <w:t>Asset Management Uplift Programme (Asset Tactics Review), Graduate Team Member  |  June 2024 â€“ September 2024</w:t>
       </w:r>
     </w:p>
     <w:p>
@@ -546,7 +644,7 @@
         <w:rPr>
           <w:sz w:val="20"/>
         </w:rPr>
-        <w:t>Defect elimination – bad actor review identifying the worst performing site assets on the basis of downtime and associated criticality.</w:t>
+        <w:t>Defect elimination â€“ bad actor review identifying the worst performing site assets on the basis of downtime and associated criticality.</w:t>
       </w:r>
     </w:p>
     <w:p>
@@ -558,7 +656,7 @@
         <w:rPr>
           <w:sz w:val="20"/>
         </w:rPr>
-        <w:t>Work management – changeout analysis of SAP PM01, PM02 and PM03 notifications to find incomplete changeouts, notification timing issues and causes of unnecessary downtime.</w:t>
+        <w:t>Work management â€“ changeout analysis of SAP PM01, PM02 and PM03 notifications to find incomplete changeouts, notification timing issues and causes of unnecessary downtime.</w:t>
       </w:r>
     </w:p>
     <w:p>
@@ -570,7 +668,7 @@
         <w:rPr>
           <w:sz w:val="20"/>
         </w:rPr>
-        <w:t>Maintenance strategy documentation – PRT and task description review to find gaps or missing information that would make it difficult for an inspector to assess asset condition.</w:t>
+        <w:t>Maintenance strategy documentation â€“ PRT and task description review to find gaps or missing information that would make it difficult for an inspector to assess asset condition.</w:t>
       </w:r>
     </w:p>
     <w:p>
@@ -594,7 +692,7 @@
           <w:i/>
           <w:sz w:val="19"/>
         </w:rPr>
-        <w:t>Closed Work Order and Parts Reallocation, Storefront  |  November 2022 – March 2024 (part time / ad hoc)</w:t>
+        <w:t>Closed Work Order and Parts Reallocation, Storefront  |  November 2022 â€“ March 2024 (part time / ad hoc)</w:t>
       </w:r>
     </w:p>
     <w:p>
@@ -655,7 +753,7 @@
           <w:b w:val="0"/>
           <w:sz w:val="19"/>
         </w:rPr>
-        <w:t>Bachelor of Science – Mechanical Engineering &amp; Data Science</w:t>
+        <w:t>Bachelor of Science â€“ Mechanical Engineering &amp; Data Science</w:t>
       </w:r>
     </w:p>
     <w:p>
@@ -667,7 +765,7 @@
         <w:rPr>
           <w:sz w:val="20"/>
         </w:rPr>
-        <w:t>Chatbot web application (2023) – group project building a question-answering chatbot over a UWA document set, using Python, cloud-hosted AI services, HTML/CSS and JavaScript. Iterated to ~95% answer accuracy; 90% project mark.</w:t>
+        <w:t>Chatbot web application (2023) â€“ group project building a question-answering chatbot over a UWA document set, using Python, cloud-hosted AI services, HTML/CSS and JavaScript. Iterated to ~95% answer accuracy; 90% project mark.</w:t>
       </w:r>
     </w:p>
     <w:p>
@@ -679,7 +777,7 @@
           <w:b w:val="0"/>
           <w:sz w:val="19"/>
         </w:rPr>
-        <w:t>Hale School, Western Australia – 2013 – 2019</w:t>
+        <w:t>Hale School, Western Australia â€“ 2013 â€“ 2019</w:t>
       </w:r>
     </w:p>
     <w:p>
@@ -704,7 +802,7 @@
           <w:b w:val="0"/>
           <w:sz w:val="20"/>
         </w:rPr>
-        <w:t>Chris Shannen – Partner, Asset Management, Deloitte – 0427 028 940</w:t>
+        <w:t>Chris Shannen â€“ Partner, Asset Management, Deloitte â€“ 0427 028 940</w:t>
       </w:r>
     </w:p>
     <w:p>
@@ -716,7 +814,7 @@
           <w:b w:val="0"/>
           <w:sz w:val="20"/>
         </w:rPr>
-        <w:t>Adrienne Holt – Owner / Senior Manager, Paramount Purchasing – 0402 214 515</w:t>
+        <w:t>Adrienne Holt â€“ Owner / Senior Manager, Paramount Purchasing â€“ 0402 214 515</w:t>
       </w:r>
     </w:p>
     <w:sectPr>
@@ -729,7 +827,70 @@
 </w:document>
 </file>
 
-<file path=word/numbering.xml><?xml version="1.0" encoding="utf-8"?>
+<file path=word\fontTable.xml><?xml version="1.0" encoding="utf-8"?>
+<w:fonts xmlns:mc="http://schemas.openxmlformats.org/markup-compatibility/2006" xmlns:r="http://schemas.openxmlformats.org/officeDocument/2006/relationships" xmlns:w="http://schemas.openxmlformats.org/wordprocessingml/2006/main" xmlns:w14="http://schemas.microsoft.com/office/word/2010/wordml" mc:Ignorable="w14">
+  <w:font w:name="Symbol">
+    <w:panose1 w:val="00000000000000000000"/>
+    <w:charset w:val="02"/>
+    <w:family w:val="auto"/>
+    <w:pitch w:val="variable"/>
+    <w:sig w:usb0="00000000" w:usb1="10000000" w:usb2="00000000" w:usb3="00000000" w:csb0="80000000" w:csb1="00000000"/>
+  </w:font>
+  <w:font w:name="Times New Roman">
+    <w:panose1 w:val="02020603050405020304"/>
+    <w:charset w:val="00"/>
+    <w:family w:val="auto"/>
+    <w:pitch w:val="variable"/>
+    <w:sig w:usb0="E0002AFF" w:usb1="C0007841" w:usb2="00000009" w:usb3="00000000" w:csb0="000001FF" w:csb1="00000000"/>
+  </w:font>
+  <w:font w:name="Cambria">
+    <w:panose1 w:val="02040503050406030204"/>
+    <w:charset w:val="00"/>
+    <w:family w:val="auto"/>
+    <w:pitch w:val="variable"/>
+    <w:sig w:usb0="E00002FF" w:usb1="400004FF" w:usb2="00000000" w:usb3="00000000" w:csb0="0000019F" w:csb1="00000000"/>
+  </w:font>
+  <w:font w:name="ＭＳ 明朝">
+    <w:panose1 w:val="00000000000000000000"/>
+    <w:charset w:val="80"/>
+    <w:family w:val="roman"/>
+    <w:notTrueType/>
+    <w:pitch w:val="fixed"/>
+    <w:sig w:usb0="00000001" w:usb1="08070000" w:usb2="00000010" w:usb3="00000000" w:csb0="00020000" w:csb1="00000000"/>
+  </w:font>
+  <w:font w:name="Calibri">
+    <w:panose1 w:val="020F0502020204030204"/>
+    <w:charset w:val="00"/>
+    <w:family w:val="auto"/>
+    <w:pitch w:val="variable"/>
+    <w:sig w:usb0="E10002FF" w:usb1="4000ACFF" w:usb2="00000009" w:usb3="00000000" w:csb0="0000019F" w:csb1="00000000"/>
+  </w:font>
+  <w:font w:name="ＭＳ ゴシック">
+    <w:panose1 w:val="00000000000000000000"/>
+    <w:charset w:val="80"/>
+    <w:family w:val="modern"/>
+    <w:notTrueType/>
+    <w:pitch w:val="fixed"/>
+    <w:sig w:usb0="00000001" w:usb1="08070000" w:usb2="00000010" w:usb3="00000000" w:csb0="00020000" w:csb1="00000000"/>
+  </w:font>
+  <w:font w:name="Courier">
+    <w:panose1 w:val="02000500000000000000"/>
+    <w:charset w:val="00"/>
+    <w:family w:val="auto"/>
+    <w:pitch w:val="variable"/>
+    <w:sig w:usb0="00000003" w:usb1="00000000" w:usb2="00000000" w:usb3="00000000" w:csb0="00000001" w:csb1="00000000"/>
+  </w:font>
+  <w:font w:name="Arial">
+    <w:panose1 w:val="020B0604020202020204"/>
+    <w:charset w:val="00"/>
+    <w:family w:val="auto"/>
+    <w:pitch w:val="variable"/>
+    <w:sig w:usb0="E0002AFF" w:usb1="C0007843" w:usb2="00000009" w:usb3="00000000" w:csb0="000001FF" w:csb1="00000000"/>
+  </w:font>
+</w:fonts>
+</file>
+
+<file path=word\numbering.xml><?xml version="1.0" encoding="utf-8"?>
 <w:numbering xmlns:wpc="http://schemas.microsoft.com/office/word/2010/wordprocessingCanvas" xmlns:mo="http://schemas.microsoft.com/office/mac/office/2008/main" xmlns:mc="http://schemas.openxmlformats.org/markup-compatibility/2006" xmlns:mv="urn:schemas-microsoft-com:mac:vml" xmlns:o="urn:schemas-microsoft-com:office:office" xmlns:r="http://schemas.openxmlformats.org/officeDocument/2006/relationships" xmlns:m="http://schemas.openxmlformats.org/officeDocument/2006/math" xmlns:v="urn:schemas-microsoft-com:vml" xmlns:wp14="http://schemas.microsoft.com/office/word/2010/wordprocessingDrawing" xmlns:wp="http://schemas.openxmlformats.org/drawingml/2006/wordprocessingDrawing" xmlns:w10="urn:schemas-microsoft-com:office:word" xmlns:w="http://schemas.openxmlformats.org/wordprocessingml/2006/main" xmlns:w14="http://schemas.microsoft.com/office/word/2010/wordml" xmlns:wpg="http://schemas.microsoft.com/office/word/2010/wordprocessingGroup" xmlns:wpi="http://schemas.microsoft.com/office/word/2010/wordprocessingInk" xmlns:wne="http://schemas.microsoft.com/office/word/2006/wordml" xmlns:wps="http://schemas.microsoft.com/office/word/2010/wordprocessingShape" mc:Ignorable="w14 wp14">
   <w:abstractNum w:abstractNumId="0">
     <w:nsid w:val="FFFFFF7C"/>
@@ -932,7 +1093,62 @@
 </w:numbering>
 </file>
 
-<file path=word/styles.xml><?xml version="1.0" encoding="utf-8"?>
+<file path=word\settings.xml><?xml version="1.0" encoding="utf-8"?>
+<w:settings xmlns:mc="http://schemas.openxmlformats.org/markup-compatibility/2006" xmlns:o="urn:schemas-microsoft-com:office:office" xmlns:r="http://schemas.openxmlformats.org/officeDocument/2006/relationships" xmlns:m="http://schemas.openxmlformats.org/officeDocument/2006/math" xmlns:v="urn:schemas-microsoft-com:vml" xmlns:w10="urn:schemas-microsoft-com:office:word" xmlns:w="http://schemas.openxmlformats.org/wordprocessingml/2006/main" xmlns:w14="http://schemas.microsoft.com/office/word/2010/wordml" xmlns:sl="http://schemas.openxmlformats.org/schemaLibrary/2006/main" mc:Ignorable="w14">
+  <w:zoom w:val="bestFit"/>
+  <w:proofState w:spelling="clean" w:grammar="clean"/>
+  <w:defaultTabStop w:val="720"/>
+  <w:characterSpacingControl w:val="doNotCompress"/>
+  <w:savePreviewPicture/>
+  <w:compat>
+    <w:useFELayout/>
+    <w:compatSetting w:name="compatibilityMode" w:uri="http://schemas.microsoft.com/office/word" w:val="14"/>
+    <w:compatSetting w:name="overrideTableStyleFontSizeAndJustification" w:uri="http://schemas.microsoft.com/office/word" w:val="1"/>
+    <w:compatSetting w:name="enableOpenTypeFeatures" w:uri="http://schemas.microsoft.com/office/word" w:val="1"/>
+    <w:compatSetting w:name="doNotFlipMirrorIndents" w:uri="http://schemas.microsoft.com/office/word" w:val="1"/>
+  </w:compat>
+  <w:rsids>
+    <w:rsidRoot w:val="00B47730"/>
+    <w:rsid w:val="00034616"/>
+    <w:rsid w:val="0006063C"/>
+    <w:rsid w:val="0015074B"/>
+    <w:rsid w:val="0029639D"/>
+    <w:rsid w:val="00326F90"/>
+    <w:rsid w:val="00AA1D8D"/>
+    <w:rsid w:val="00B47730"/>
+    <w:rsid w:val="00CB0664"/>
+    <w:rsid w:val="00FC693F"/>
+  </w:rsids>
+  <m:mathPr>
+    <m:mathFont m:val="Cambria Math"/>
+    <m:brkBin m:val="before"/>
+    <m:brkBinSub m:val="--"/>
+    <m:smallFrac m:val="0"/>
+    <m:dispDef/>
+    <m:lMargin m:val="0"/>
+    <m:rMargin m:val="0"/>
+    <m:defJc m:val="centerGroup"/>
+    <m:wrapIndent m:val="1440"/>
+    <m:intLim m:val="subSup"/>
+    <m:naryLim m:val="undOvr"/>
+  </m:mathPr>
+  <w:themeFontLang w:val="en-US" w:eastAsia="ja-JP"/>
+  <w:clrSchemeMapping w:bg1="light1" w:t1="dark1" w:bg2="light2" w:t2="dark2" w:accent1="accent1" w:accent2="accent2" w:accent3="accent3" w:accent4="accent4" w:accent5="accent5" w:accent6="accent6" w:hyperlink="hyperlink" w:followedHyperlink="followedHyperlink"/>
+  <w:doNotAutoCompressPictures/>
+  <w:shapeDefaults>
+    <o:shapedefaults v:ext="edit" spidmax="1027"/>
+    <o:shapelayout v:ext="edit">
+      <o:idmap v:ext="edit" data="1"/>
+    </o:shapelayout>
+  </w:shapeDefaults>
+  <w:decimalSymbol w:val="."/>
+  <w:listSeparator w:val=","/>
+  <w14:docId w14:val="24062061"/>
+  <w14:defaultImageDpi w14:val="300"/>
+</w:settings>
+</file>
+
+<file path=word\styles.xml><?xml version="1.0" encoding="utf-8"?>
 <w:styles xmlns:mc="http://schemas.openxmlformats.org/markup-compatibility/2006" xmlns:r="http://schemas.openxmlformats.org/officeDocument/2006/relationships" xmlns:w="http://schemas.openxmlformats.org/wordprocessingml/2006/main" xmlns:w14="http://schemas.microsoft.com/office/word/2010/wordml" mc:Ignorable="w14">
   <w:docDefaults>
     <w:rPrDefault>
@@ -12785,7 +13001,7 @@
 </w:styles>
 </file>
 
-<file path=word/stylesWithEffects.xml><?xml version="1.0" encoding="utf-8"?>
+<file path=word\stylesWithEffects.xml><?xml version="1.0" encoding="utf-8"?>
 <w:styles xmlns:wpc="http://schemas.microsoft.com/office/word/2010/wordprocessingCanvas" xmlns:mo="http://schemas.microsoft.com/office/mac/office/2008/main" xmlns:mc="http://schemas.openxmlformats.org/markup-compatibility/2006" xmlns:mv="urn:schemas-microsoft-com:mac:vml" xmlns:o="urn:schemas-microsoft-com:office:office" xmlns:r="http://schemas.openxmlformats.org/officeDocument/2006/relationships" xmlns:m="http://schemas.openxmlformats.org/officeDocument/2006/math" xmlns:v="urn:schemas-microsoft-com:vml" xmlns:wp14="http://schemas.microsoft.com/office/word/2010/wordprocessingDrawing" xmlns:wp="http://schemas.openxmlformats.org/drawingml/2006/wordprocessingDrawing" xmlns:w10="urn:schemas-microsoft-com:office:word" xmlns:w="http://schemas.openxmlformats.org/wordprocessingml/2006/main" xmlns:w14="http://schemas.microsoft.com/office/word/2010/wordml" xmlns:wpg="http://schemas.microsoft.com/office/word/2010/wordprocessingGroup" xmlns:wpi="http://schemas.microsoft.com/office/word/2010/wordprocessingInk" xmlns:wne="http://schemas.microsoft.com/office/word/2006/wordml" xmlns:wps="http://schemas.microsoft.com/office/word/2010/wordprocessingShape" mc:Ignorable="w14 wp14">
   <w:docDefaults>
     <w:rPrDefault>
@@ -24587,7 +24803,7 @@
 </w:styles>
 </file>
 
-<file path=word/theme/theme1.xml><?xml version="1.0" encoding="utf-8"?>
+<file path=word\theme\theme1.xml><?xml version="1.0" encoding="utf-8"?>
 <a:theme xmlns:a="http://schemas.openxmlformats.org/drawingml/2006/main" name="Office Theme">
   <a:themeElements>
     <a:clrScheme name="Office">
@@ -24907,14 +25123,9 @@
 </a:theme>
 </file>
 
-<file path=customXml/item1.xml><?xml version="1.0" encoding="utf-8"?>
-<b:Sources xmlns:b="http://schemas.openxmlformats.org/officeDocument/2006/bibliography" xmlns="http://schemas.openxmlformats.org/officeDocument/2006/bibliography" SelectedStyle="/APA.XSL" StyleName="APA"/>
-</file>
-
-<file path=customXml/itemProps1.xml><?xml version="1.0" encoding="utf-8"?>
-<ds:datastoreItem xmlns:ds="http://schemas.openxmlformats.org/officeDocument/2006/customXml" ds:itemID="{EF278816-EC6F-A645-907D-7F25AECB1D4A}">
-  <ds:schemaRefs>
-    <ds:schemaRef ds:uri="http://schemas.openxmlformats.org/officeDocument/2006/bibliography"/>
-  </ds:schemaRefs>
-</ds:datastoreItem>
+<file path=word\webSettings.xml><?xml version="1.0" encoding="utf-8"?>
+<w:webSettings xmlns:mc="http://schemas.openxmlformats.org/markup-compatibility/2006" xmlns:r="http://schemas.openxmlformats.org/officeDocument/2006/relationships" xmlns:w="http://schemas.openxmlformats.org/wordprocessingml/2006/main" xmlns:w14="http://schemas.microsoft.com/office/word/2010/wordml" mc:Ignorable="w14">
+  <w:allowPNG/>
+  <w:doNotSaveAsSingleFile/>
+</w:webSettings>
 </file>
</xml_diff>